<commit_message>
Enhance and redesign live exam proctoring dashboard client component, integrate mock candidates and clock, recompile project documentation with live proctoring screenshot
</commit_message>
<xml_diff>
--- a/Project_Documentation.docx
+++ b/Project_Documentation.docx
@@ -5471,7 +5471,7 @@
       <w:r>
         <w:drawing>
           <wp:inline xmlns:a="http://schemas.openxmlformats.org/drawingml/2006/main" xmlns:pic="http://schemas.openxmlformats.org/drawingml/2006/picture">
-            <wp:extent cx="5303520" cy="2695048"/>
+            <wp:extent cx="5303520" cy="2618613"/>
             <wp:docPr id="7" name="Picture 7"/>
             <wp:cNvGraphicFramePr>
               <a:graphicFrameLocks noChangeAspect="1"/>
@@ -5492,7 +5492,7 @@
                   <pic:spPr>
                     <a:xfrm>
                       <a:off x="0" y="0"/>
-                      <a:ext cx="5303520" cy="2695048"/>
+                      <a:ext cx="5303520" cy="2618613"/>
                     </a:xfrm>
                     <a:prstGeom prst="rect"/>
                   </pic:spPr>
@@ -5696,7 +5696,7 @@
       <w:r>
         <w:drawing>
           <wp:inline xmlns:a="http://schemas.openxmlformats.org/drawingml/2006/main" xmlns:pic="http://schemas.openxmlformats.org/drawingml/2006/picture">
-            <wp:extent cx="5303520" cy="5303520"/>
+            <wp:extent cx="5303520" cy="9173432"/>
             <wp:docPr id="12" name="Picture 12"/>
             <wp:cNvGraphicFramePr>
               <a:graphicFrameLocks noChangeAspect="1"/>
@@ -5717,7 +5717,7 @@
                   <pic:spPr>
                     <a:xfrm>
                       <a:off x="0" y="0"/>
-                      <a:ext cx="5303520" cy="5303520"/>
+                      <a:ext cx="5303520" cy="9173432"/>
                     </a:xfrm>
                     <a:prstGeom prst="rect"/>
                   </pic:spPr>

</xml_diff>

<commit_message>
Enhance proctoring dashboard: remove mock candidates, add Force Audio button, visual feedback on hardware mute/disable, functional Alerts/Reports/Settings tabs, and Admin-only log clear/deletion features
</commit_message>
<xml_diff>
--- a/Project_Documentation.docx
+++ b/Project_Documentation.docx
@@ -5696,7 +5696,7 @@
       <w:r>
         <w:drawing>
           <wp:inline xmlns:a="http://schemas.openxmlformats.org/drawingml/2006/main" xmlns:pic="http://schemas.openxmlformats.org/drawingml/2006/picture">
-            <wp:extent cx="5303520" cy="9173432"/>
+            <wp:extent cx="5303520" cy="7076884"/>
             <wp:docPr id="12" name="Picture 12"/>
             <wp:cNvGraphicFramePr>
               <a:graphicFrameLocks noChangeAspect="1"/>
@@ -5717,7 +5717,7 @@
                   <pic:spPr>
                     <a:xfrm>
                       <a:off x="0" y="0"/>
-                      <a:ext cx="5303520" cy="9173432"/>
+                      <a:ext cx="5303520" cy="7076884"/>
                     </a:xfrm>
                     <a:prstGeom prst="rect"/>
                   </pic:spPr>

</xml_diff>